<commit_message>
feat(docgen): ذ.م.م محضر template edit -- meeting held at the head office
The lawyer's edit to the ذ.م.م محضر template: the title no longer repeats
«شركة ذات مسئولية محدودة», the meeting place is the company address
({{ company_address }} replaces {{ meeting_place }}), and empty paragraphs
are gone. The contract drops meeting_place for ذ.م.م only (مساهمة keeps it)
and the prose digest is re-pinned.

Co-Authored-By: Claude Opus 5.5 <noreply@anthropic.com>
</commit_message>
<xml_diff>
--- a/src/legal_assistant/docgen/templates/files/محضر_تعديل_شركة_ذات_مسئولية_محدودة_template.docx
+++ b/src/legal_assistant/docgen/templates/files/محضر_تعديل_شركة_ذات_مسئولية_محدودة_template.docx
@@ -23,6 +23,10 @@
         <w:bidi/>
         <w:spacing w:after="400" w:line="265" w:lineRule="auto"/>
         <w:jc w:val="center"/>
+        <w:rPr>
+          <w:rFonts w:hint="cs"/>
+          <w:lang w:bidi="ar-EG"/>
+        </w:rPr>
       </w:pPr>
       <w:r>
         <w:rPr>
@@ -31,7 +35,67 @@
           <w:sz w:val="26"/>
           <w:szCs w:val="26"/>
         </w:rPr>
-        <w:t>لشركة {{ company_name }} شركة ذات مسئولية محدودة</w:t>
+        <w:t xml:space="preserve">لشركة </w:t>
+      </w:r>
+      <w:proofErr w:type="gramStart"/>
+      <w:r>
+        <w:rPr>
+          <w:b/>
+          <w:bCs/>
+          <w:sz w:val="26"/>
+          <w:szCs w:val="26"/>
+        </w:rPr>
+        <w:t xml:space="preserve">{{ </w:t>
+      </w:r>
+      <w:proofErr w:type="spellStart"/>
+      <w:r>
+        <w:rPr>
+          <w:b/>
+          <w:bCs/>
+          <w:sz w:val="26"/>
+          <w:szCs w:val="26"/>
+        </w:rPr>
+        <w:t>company</w:t>
+      </w:r>
+      <w:proofErr w:type="gramEnd"/>
+      <w:r>
+        <w:rPr>
+          <w:b/>
+          <w:bCs/>
+          <w:sz w:val="26"/>
+          <w:szCs w:val="26"/>
+        </w:rPr>
+        <w:t>_</w:t>
+      </w:r>
+      <w:proofErr w:type="gramStart"/>
+      <w:r>
+        <w:rPr>
+          <w:b/>
+          <w:bCs/>
+          <w:sz w:val="26"/>
+          <w:szCs w:val="26"/>
+        </w:rPr>
+        <w:t>name</w:t>
+      </w:r>
+      <w:proofErr w:type="spellEnd"/>
+      <w:r>
+        <w:rPr>
+          <w:b/>
+          <w:bCs/>
+          <w:sz w:val="26"/>
+          <w:szCs w:val="26"/>
+        </w:rPr>
+        <w:t xml:space="preserve"> }</w:t>
+      </w:r>
+      <w:proofErr w:type="gramEnd"/>
+      <w:r>
+        <w:rPr>
+          <w:b/>
+          <w:bCs/>
+          <w:sz w:val="26"/>
+          <w:szCs w:val="26"/>
+        </w:rPr>
+        <w:t>}</w:t>
       </w:r>
     </w:p>
     <w:p>
@@ -47,7 +111,264 @@
         <w:t>:</w:t>
       </w:r>
       <w:r>
-        <w:t xml:space="preserve"> انه فى يوم {{ day_name }} الموافق {{ day_date }} فى تمام الساعة {{ meeting_time }} وبمقر الشركة الكائن فى {{ meeting_place }} اجتمعت الجمعية العامة غير العادية للشركاء بشركة {{ company_name }} شركة ذات مسئولية محدودة والمؤسسة طبقا لأحكام القانون رقم {{ law_number }} لسنة {{ law_year }} والمقيدة بالسجل التجاري رقم {{ commercial_registration_no }} بتاريخ {{ commercial_registration_date }}، وقد حضر الاجتماع الشركاء الآتى بيانهم:</w:t>
+        <w:t xml:space="preserve"> انه </w:t>
+      </w:r>
+      <w:proofErr w:type="spellStart"/>
+      <w:r>
+        <w:t>فى</w:t>
+      </w:r>
+      <w:proofErr w:type="spellEnd"/>
+      <w:r>
+        <w:t xml:space="preserve"> يوم </w:t>
+      </w:r>
+      <w:proofErr w:type="gramStart"/>
+      <w:r>
+        <w:t xml:space="preserve">{{ </w:t>
+      </w:r>
+      <w:proofErr w:type="spellStart"/>
+      <w:r>
+        <w:t>day</w:t>
+      </w:r>
+      <w:proofErr w:type="gramEnd"/>
+      <w:r>
+        <w:t>_</w:t>
+      </w:r>
+      <w:proofErr w:type="gramStart"/>
+      <w:r>
+        <w:t>name</w:t>
+      </w:r>
+      <w:proofErr w:type="spellEnd"/>
+      <w:r>
+        <w:t xml:space="preserve"> }</w:t>
+      </w:r>
+      <w:proofErr w:type="gramEnd"/>
+      <w:r>
+        <w:t xml:space="preserve">} الموافق </w:t>
+      </w:r>
+      <w:proofErr w:type="gramStart"/>
+      <w:r>
+        <w:t xml:space="preserve">{{ </w:t>
+      </w:r>
+      <w:proofErr w:type="spellStart"/>
+      <w:r>
+        <w:t>day</w:t>
+      </w:r>
+      <w:proofErr w:type="gramEnd"/>
+      <w:r>
+        <w:t>_</w:t>
+      </w:r>
+      <w:proofErr w:type="gramStart"/>
+      <w:r>
+        <w:t>date</w:t>
+      </w:r>
+      <w:proofErr w:type="spellEnd"/>
+      <w:r>
+        <w:t xml:space="preserve"> }</w:t>
+      </w:r>
+      <w:proofErr w:type="gramEnd"/>
+      <w:r>
+        <w:t xml:space="preserve">} </w:t>
+      </w:r>
+      <w:proofErr w:type="spellStart"/>
+      <w:r>
+        <w:t>فى</w:t>
+      </w:r>
+      <w:proofErr w:type="spellEnd"/>
+      <w:r>
+        <w:t xml:space="preserve"> تمام الساعة </w:t>
+      </w:r>
+      <w:proofErr w:type="gramStart"/>
+      <w:r>
+        <w:t xml:space="preserve">{{ </w:t>
+      </w:r>
+      <w:proofErr w:type="spellStart"/>
+      <w:r>
+        <w:t>meeting</w:t>
+      </w:r>
+      <w:proofErr w:type="gramEnd"/>
+      <w:r>
+        <w:t>_</w:t>
+      </w:r>
+      <w:proofErr w:type="gramStart"/>
+      <w:r>
+        <w:t>time</w:t>
+      </w:r>
+      <w:proofErr w:type="spellEnd"/>
+      <w:r>
+        <w:t xml:space="preserve"> }</w:t>
+      </w:r>
+      <w:proofErr w:type="gramEnd"/>
+      <w:r>
+        <w:t xml:space="preserve">} وبمقر الشركة الكائن </w:t>
+      </w:r>
+      <w:proofErr w:type="spellStart"/>
+      <w:r>
+        <w:t>فى</w:t>
+      </w:r>
+      <w:proofErr w:type="spellEnd"/>
+      <w:r>
+        <w:t xml:space="preserve"> </w:t>
+      </w:r>
+      <w:proofErr w:type="gramStart"/>
+      <w:r>
+        <w:t xml:space="preserve">{{ </w:t>
+      </w:r>
+      <w:proofErr w:type="spellStart"/>
+      <w:r>
+        <w:rPr>
+          <w:rtl w:val="0"/>
+        </w:rPr>
+        <w:t>company</w:t>
+      </w:r>
+      <w:proofErr w:type="gramEnd"/>
+      <w:r>
+        <w:rPr>
+          <w:rtl w:val="0"/>
+        </w:rPr>
+        <w:t>_</w:t>
+      </w:r>
+      <w:proofErr w:type="gramStart"/>
+      <w:r>
+        <w:rPr>
+          <w:rtl w:val="0"/>
+        </w:rPr>
+        <w:t>address</w:t>
+      </w:r>
+      <w:proofErr w:type="spellEnd"/>
+      <w:r>
+        <w:t xml:space="preserve"> }</w:t>
+      </w:r>
+      <w:proofErr w:type="gramEnd"/>
+      <w:r>
+        <w:t xml:space="preserve">} اجتمعت الجمعية العامة غير العادية للشركاء بشركة </w:t>
+      </w:r>
+      <w:proofErr w:type="gramStart"/>
+      <w:r>
+        <w:t xml:space="preserve">{{ </w:t>
+      </w:r>
+      <w:proofErr w:type="spellStart"/>
+      <w:r>
+        <w:t>company</w:t>
+      </w:r>
+      <w:proofErr w:type="gramEnd"/>
+      <w:r>
+        <w:t>_</w:t>
+      </w:r>
+      <w:proofErr w:type="gramStart"/>
+      <w:r>
+        <w:t>name</w:t>
+      </w:r>
+      <w:proofErr w:type="spellEnd"/>
+      <w:r>
+        <w:t xml:space="preserve"> }</w:t>
+      </w:r>
+      <w:proofErr w:type="gramEnd"/>
+      <w:r>
+        <w:t xml:space="preserve">} والمؤسسة طبقا لأحكام القانون رقم </w:t>
+      </w:r>
+      <w:proofErr w:type="gramStart"/>
+      <w:r>
+        <w:t xml:space="preserve">{{ </w:t>
+      </w:r>
+      <w:proofErr w:type="spellStart"/>
+      <w:r>
+        <w:t>law</w:t>
+      </w:r>
+      <w:proofErr w:type="gramEnd"/>
+      <w:r>
+        <w:t>_</w:t>
+      </w:r>
+      <w:proofErr w:type="gramStart"/>
+      <w:r>
+        <w:t>number</w:t>
+      </w:r>
+      <w:proofErr w:type="spellEnd"/>
+      <w:r>
+        <w:t xml:space="preserve"> }</w:t>
+      </w:r>
+      <w:proofErr w:type="gramEnd"/>
+      <w:r>
+        <w:t xml:space="preserve">} لسنة </w:t>
+      </w:r>
+      <w:proofErr w:type="gramStart"/>
+      <w:r>
+        <w:t xml:space="preserve">{{ </w:t>
+      </w:r>
+      <w:proofErr w:type="spellStart"/>
+      <w:r>
+        <w:t>law</w:t>
+      </w:r>
+      <w:proofErr w:type="gramEnd"/>
+      <w:r>
+        <w:t>_</w:t>
+      </w:r>
+      <w:proofErr w:type="gramStart"/>
+      <w:r>
+        <w:t>year</w:t>
+      </w:r>
+      <w:proofErr w:type="spellEnd"/>
+      <w:r>
+        <w:t xml:space="preserve"> }</w:t>
+      </w:r>
+      <w:proofErr w:type="gramEnd"/>
+      <w:r>
+        <w:t xml:space="preserve">} والمقيدة بالسجل التجاري رقم </w:t>
+      </w:r>
+      <w:proofErr w:type="gramStart"/>
+      <w:r>
+        <w:t xml:space="preserve">{{ </w:t>
+      </w:r>
+      <w:proofErr w:type="spellStart"/>
+      <w:r>
+        <w:t>commercial</w:t>
+      </w:r>
+      <w:proofErr w:type="gramEnd"/>
+      <w:r>
+        <w:t>_registration_</w:t>
+      </w:r>
+      <w:proofErr w:type="gramStart"/>
+      <w:r>
+        <w:t>no</w:t>
+      </w:r>
+      <w:proofErr w:type="spellEnd"/>
+      <w:r>
+        <w:t xml:space="preserve"> }</w:t>
+      </w:r>
+      <w:proofErr w:type="gramEnd"/>
+      <w:r>
+        <w:t xml:space="preserve">} بتاريخ </w:t>
+      </w:r>
+      <w:proofErr w:type="gramStart"/>
+      <w:r>
+        <w:t xml:space="preserve">{{ </w:t>
+      </w:r>
+      <w:proofErr w:type="spellStart"/>
+      <w:r>
+        <w:t>commercial</w:t>
+      </w:r>
+      <w:proofErr w:type="gramEnd"/>
+      <w:r>
+        <w:t>_registration_</w:t>
+      </w:r>
+      <w:proofErr w:type="gramStart"/>
+      <w:r>
+        <w:t>date</w:t>
+      </w:r>
+      <w:proofErr w:type="spellEnd"/>
+      <w:r>
+        <w:t xml:space="preserve"> }</w:t>
+      </w:r>
+      <w:proofErr w:type="gramEnd"/>
+      <w:r>
+        <w:t xml:space="preserve">}، وقد حضر الاجتماع الشركاء </w:t>
+      </w:r>
+      <w:proofErr w:type="spellStart"/>
+      <w:r>
+        <w:t>الآتى</w:t>
+      </w:r>
+      <w:proofErr w:type="spellEnd"/>
+      <w:r>
+        <w:t xml:space="preserve"> بيانهم:</w:t>
       </w:r>
     </w:p>
     <w:tbl>
@@ -75,12 +396,6 @@
         <w:gridCol w:w="1914"/>
       </w:tblGrid>
       <w:tr>
-        <w:tblPrEx>
-          <w:tblCellMar>
-            <w:top w:w="0" w:type="dxa"/>
-            <w:bottom w:w="0" w:type="dxa"/>
-          </w:tblCellMar>
-        </w:tblPrEx>
         <w:trPr>
           <w:tblHeader/>
         </w:trPr>
@@ -202,12 +517,6 @@
         </w:tc>
       </w:tr>
       <w:tr>
-        <w:tblPrEx>
-          <w:tblCellMar>
-            <w:top w:w="0" w:type="dxa"/>
-            <w:bottom w:w="0" w:type="dxa"/>
-          </w:tblCellMar>
-        </w:tblPrEx>
         <w:tc>
           <w:tcPr>
             <w:tcW w:w="3000" w:type="dxa"/>
@@ -221,7 +530,39 @@
           </w:tcPr>
           <w:p>
             <w:r>
-              <w:t>{%tr for p in attendees %}</w:t>
+              <w:t>{%</w:t>
+            </w:r>
+            <w:proofErr w:type="spellStart"/>
+            <w:r>
+              <w:t>tr</w:t>
+            </w:r>
+            <w:proofErr w:type="spellEnd"/>
+            <w:r>
+              <w:t xml:space="preserve"> </w:t>
+            </w:r>
+            <w:proofErr w:type="spellStart"/>
+            <w:r>
+              <w:t>for</w:t>
+            </w:r>
+            <w:proofErr w:type="spellEnd"/>
+            <w:r>
+              <w:t xml:space="preserve"> p </w:t>
+            </w:r>
+            <w:proofErr w:type="spellStart"/>
+            <w:r>
+              <w:t>in</w:t>
+            </w:r>
+            <w:proofErr w:type="spellEnd"/>
+            <w:r>
+              <w:t xml:space="preserve"> </w:t>
+            </w:r>
+            <w:proofErr w:type="spellStart"/>
+            <w:r>
+              <w:t>attendees</w:t>
+            </w:r>
+            <w:proofErr w:type="spellEnd"/>
+            <w:r>
+              <w:t xml:space="preserve"> %}</w:t>
             </w:r>
           </w:p>
         </w:tc>
@@ -236,9 +577,7 @@
             </w:tcMar>
             <w:vAlign w:val="center"/>
           </w:tcPr>
-          <w:p>
-            <w:r/>
-          </w:p>
+          <w:p/>
         </w:tc>
         <w:tc>
           <w:tcPr>
@@ -251,9 +590,7 @@
             </w:tcMar>
             <w:vAlign w:val="center"/>
           </w:tcPr>
-          <w:p>
-            <w:r/>
-          </w:p>
+          <w:p/>
         </w:tc>
         <w:tc>
           <w:tcPr>
@@ -266,18 +603,10 @@
             </w:tcMar>
             <w:vAlign w:val="center"/>
           </w:tcPr>
-          <w:p>
-            <w:r/>
-          </w:p>
+          <w:p/>
         </w:tc>
       </w:tr>
       <w:tr>
-        <w:tblPrEx>
-          <w:tblCellMar>
-            <w:top w:w="0" w:type="dxa"/>
-            <w:bottom w:w="0" w:type="dxa"/>
-          </w:tblCellMar>
-        </w:tblPrEx>
         <w:tc>
           <w:tcPr>
             <w:tcW w:w="3000" w:type="dxa"/>
@@ -295,12 +624,21 @@
               <w:spacing w:line="260" w:lineRule="auto"/>
               <w:jc w:val="center"/>
             </w:pPr>
+            <w:proofErr w:type="gramStart"/>
             <w:r>
               <w:rPr>
                 <w:sz w:val="20"/>
                 <w:szCs w:val="20"/>
               </w:rPr>
-              <w:t>{{ p.name }}</w:t>
+              <w:t>{{ p</w:t>
+            </w:r>
+            <w:proofErr w:type="gramEnd"/>
+            <w:r>
+              <w:rPr>
+                <w:sz w:val="20"/>
+                <w:szCs w:val="20"/>
+              </w:rPr>
+              <w:t>.name }}</w:t>
             </w:r>
           </w:p>
         </w:tc>
@@ -321,12 +659,37 @@
               <w:spacing w:line="260" w:lineRule="auto"/>
               <w:jc w:val="center"/>
             </w:pPr>
+            <w:proofErr w:type="gramStart"/>
             <w:r>
               <w:rPr>
                 <w:sz w:val="20"/>
                 <w:szCs w:val="20"/>
               </w:rPr>
-              <w:t>{{ p.shares }}</w:t>
+              <w:t xml:space="preserve">{{ </w:t>
+            </w:r>
+            <w:proofErr w:type="spellStart"/>
+            <w:r>
+              <w:rPr>
+                <w:sz w:val="20"/>
+                <w:szCs w:val="20"/>
+              </w:rPr>
+              <w:t>p</w:t>
+            </w:r>
+            <w:proofErr w:type="gramEnd"/>
+            <w:r>
+              <w:rPr>
+                <w:sz w:val="20"/>
+                <w:szCs w:val="20"/>
+              </w:rPr>
+              <w:t>.shares</w:t>
+            </w:r>
+            <w:proofErr w:type="spellEnd"/>
+            <w:r>
+              <w:rPr>
+                <w:sz w:val="20"/>
+                <w:szCs w:val="20"/>
+              </w:rPr>
+              <w:t xml:space="preserve"> }}</w:t>
             </w:r>
           </w:p>
         </w:tc>
@@ -347,12 +710,37 @@
               <w:spacing w:line="260" w:lineRule="auto"/>
               <w:jc w:val="center"/>
             </w:pPr>
+            <w:proofErr w:type="gramStart"/>
             <w:r>
               <w:rPr>
                 <w:sz w:val="20"/>
                 <w:szCs w:val="20"/>
               </w:rPr>
-              <w:t>{{ p.percentage }}</w:t>
+              <w:t xml:space="preserve">{{ </w:t>
+            </w:r>
+            <w:proofErr w:type="spellStart"/>
+            <w:r>
+              <w:rPr>
+                <w:sz w:val="20"/>
+                <w:szCs w:val="20"/>
+              </w:rPr>
+              <w:t>p</w:t>
+            </w:r>
+            <w:proofErr w:type="gramEnd"/>
+            <w:r>
+              <w:rPr>
+                <w:sz w:val="20"/>
+                <w:szCs w:val="20"/>
+              </w:rPr>
+              <w:t>.percentage</w:t>
+            </w:r>
+            <w:proofErr w:type="spellEnd"/>
+            <w:r>
+              <w:rPr>
+                <w:sz w:val="20"/>
+                <w:szCs w:val="20"/>
+              </w:rPr>
+              <w:t xml:space="preserve"> }}</w:t>
             </w:r>
           </w:p>
         </w:tc>
@@ -377,12 +765,6 @@
         </w:tc>
       </w:tr>
       <w:tr>
-        <w:tblPrEx>
-          <w:tblCellMar>
-            <w:top w:w="0" w:type="dxa"/>
-            <w:bottom w:w="0" w:type="dxa"/>
-          </w:tblCellMar>
-        </w:tblPrEx>
         <w:tc>
           <w:tcPr>
             <w:tcW w:w="3000" w:type="dxa"/>
@@ -396,7 +778,23 @@
           </w:tcPr>
           <w:p>
             <w:r>
-              <w:t>{%tr endfor %}</w:t>
+              <w:t>{%</w:t>
+            </w:r>
+            <w:proofErr w:type="spellStart"/>
+            <w:r>
+              <w:t>tr</w:t>
+            </w:r>
+            <w:proofErr w:type="spellEnd"/>
+            <w:r>
+              <w:t xml:space="preserve"> </w:t>
+            </w:r>
+            <w:proofErr w:type="spellStart"/>
+            <w:r>
+              <w:t>endfor</w:t>
+            </w:r>
+            <w:proofErr w:type="spellEnd"/>
+            <w:r>
+              <w:t xml:space="preserve"> %}</w:t>
             </w:r>
           </w:p>
         </w:tc>
@@ -411,9 +809,7 @@
             </w:tcMar>
             <w:vAlign w:val="center"/>
           </w:tcPr>
-          <w:p>
-            <w:r/>
-          </w:p>
+          <w:p/>
         </w:tc>
         <w:tc>
           <w:tcPr>
@@ -426,9 +822,7 @@
             </w:tcMar>
             <w:vAlign w:val="center"/>
           </w:tcPr>
-          <w:p>
-            <w:r/>
-          </w:p>
+          <w:p/>
         </w:tc>
         <w:tc>
           <w:tcPr>
@@ -441,9 +835,7 @@
             </w:tcMar>
             <w:vAlign w:val="center"/>
           </w:tcPr>
-          <w:p>
-            <w:r/>
-          </w:p>
+          <w:p/>
         </w:tc>
       </w:tr>
     </w:tbl>
@@ -457,10 +849,206 @@
       <w:pPr>
         <w:bidi/>
         <w:spacing w:after="240" w:line="265" w:lineRule="auto"/>
-        <w:jc w:val="both"/>
       </w:pPr>
       <w:r>
-        <w:t>وبذلك يكون الحاضرون يمثلون {{ attendance_percentage }} من إجمالى رأس مال الشركة، وحيث أن النصاب القانونى لصحة انعقاد الجمعية العامة غير العادية قد اكتمل طبقا لأحكام القانون رقم {{ law_number }} لسنة {{ law_year }} ولائحته التنفيذية وعقد تأسيس الشركة، فقد انعقدت الجمعية برئاسة السيد/ {{ chairman_name }} وتم الشروع فى مناقشة جدول الأعمال.</w:t>
+        <w:t xml:space="preserve">وبذلك يكون الحاضرون يمثلون </w:t>
+      </w:r>
+      <w:proofErr w:type="gramStart"/>
+      <w:r>
+        <w:t xml:space="preserve">{{ </w:t>
+      </w:r>
+      <w:proofErr w:type="spellStart"/>
+      <w:r>
+        <w:t>attendance</w:t>
+      </w:r>
+      <w:proofErr w:type="gramEnd"/>
+      <w:r>
+        <w:t>_</w:t>
+      </w:r>
+      <w:proofErr w:type="gramStart"/>
+      <w:r>
+        <w:t>percentage</w:t>
+      </w:r>
+      <w:proofErr w:type="spellEnd"/>
+      <w:r>
+        <w:t xml:space="preserve"> }</w:t>
+      </w:r>
+      <w:proofErr w:type="gramEnd"/>
+      <w:r>
+        <w:t xml:space="preserve">} من </w:t>
+      </w:r>
+      <w:proofErr w:type="spellStart"/>
+      <w:r>
+        <w:t>إجمالى</w:t>
+      </w:r>
+      <w:proofErr w:type="spellEnd"/>
+      <w:r>
+        <w:t xml:space="preserve"> رأس مال الشركة، وحيث أن النصاب </w:t>
+      </w:r>
+      <w:proofErr w:type="spellStart"/>
+      <w:r>
+        <w:t>القانونى</w:t>
+      </w:r>
+      <w:proofErr w:type="spellEnd"/>
+      <w:r>
+        <w:t xml:space="preserve"> لصحة انعقاد الجمعية العامة غير العادية قد اكتمل طبقا لأحكام القانون رقم </w:t>
+      </w:r>
+      <w:proofErr w:type="gramStart"/>
+      <w:r>
+        <w:t xml:space="preserve">{{ </w:t>
+      </w:r>
+      <w:proofErr w:type="spellStart"/>
+      <w:r>
+        <w:t>law</w:t>
+      </w:r>
+      <w:proofErr w:type="gramEnd"/>
+      <w:r>
+        <w:t>_</w:t>
+      </w:r>
+      <w:proofErr w:type="gramStart"/>
+      <w:r>
+        <w:t>number</w:t>
+      </w:r>
+      <w:proofErr w:type="spellEnd"/>
+      <w:r>
+        <w:t xml:space="preserve"> }</w:t>
+      </w:r>
+      <w:proofErr w:type="gramEnd"/>
+      <w:r>
+        <w:t xml:space="preserve">} لسنة </w:t>
+      </w:r>
+      <w:proofErr w:type="gramStart"/>
+      <w:r>
+        <w:t xml:space="preserve">{{ </w:t>
+      </w:r>
+      <w:proofErr w:type="spellStart"/>
+      <w:r>
+        <w:t>law</w:t>
+      </w:r>
+      <w:proofErr w:type="gramEnd"/>
+      <w:r>
+        <w:t>_</w:t>
+      </w:r>
+      <w:proofErr w:type="gramStart"/>
+      <w:r>
+        <w:t>year</w:t>
+      </w:r>
+      <w:proofErr w:type="spellEnd"/>
+      <w:r>
+        <w:t xml:space="preserve"> }</w:t>
+      </w:r>
+      <w:proofErr w:type="gramEnd"/>
+      <w:r>
+        <w:t xml:space="preserve">} ولائحته التنفيذية وعقد تأسيس الشركة، فقد انعقدت الجمعية برئاسة السيد/ </w:t>
+      </w:r>
+      <w:proofErr w:type="gramStart"/>
+      <w:r>
+        <w:t xml:space="preserve">{{ </w:t>
+      </w:r>
+      <w:proofErr w:type="spellStart"/>
+      <w:r>
+        <w:t>chairman</w:t>
+      </w:r>
+      <w:proofErr w:type="gramEnd"/>
+      <w:r>
+        <w:t>_</w:t>
+      </w:r>
+      <w:proofErr w:type="gramStart"/>
+      <w:r>
+        <w:t>name</w:t>
+      </w:r>
+      <w:proofErr w:type="spellEnd"/>
+      <w:r>
+        <w:t xml:space="preserve"> }</w:t>
+      </w:r>
+      <w:proofErr w:type="gramEnd"/>
+      <w:r>
+        <w:t xml:space="preserve">} وتم الشروع </w:t>
+      </w:r>
+      <w:proofErr w:type="spellStart"/>
+      <w:r>
+        <w:t>فى</w:t>
+      </w:r>
+      <w:proofErr w:type="spellEnd"/>
+      <w:r>
+        <w:t xml:space="preserve"> مناقشة جدول الأعمال.</w:t>
+      </w:r>
+    </w:p>
+    <w:p>
+      <w:pPr>
+        <w:bidi/>
+        <w:spacing w:after="240" w:line="265" w:lineRule="auto"/>
+      </w:pPr>
+      <w:r>
+        <w:t>ثانيا</w:t>
+      </w:r>
+      <w:r>
+        <w:t>:</w:t>
+      </w:r>
+      <w:r>
+        <w:t xml:space="preserve"> قررت الجمعية العامة غير العادية بموافقة الشركاء الحائزين على </w:t>
+      </w:r>
+      <w:proofErr w:type="gramStart"/>
+      <w:r>
+        <w:t xml:space="preserve">{{ </w:t>
+      </w:r>
+      <w:proofErr w:type="spellStart"/>
+      <w:r>
+        <w:t>approval</w:t>
+      </w:r>
+      <w:proofErr w:type="gramEnd"/>
+      <w:r>
+        <w:t>_</w:t>
+      </w:r>
+      <w:proofErr w:type="gramStart"/>
+      <w:r>
+        <w:t>percentage</w:t>
+      </w:r>
+      <w:proofErr w:type="spellEnd"/>
+      <w:r>
+        <w:t xml:space="preserve"> }</w:t>
+      </w:r>
+      <w:proofErr w:type="gramEnd"/>
+      <w:r>
+        <w:t xml:space="preserve">} من رأس مال الشركة ما </w:t>
+      </w:r>
+      <w:r>
+        <w:rPr>
+          <w:rFonts w:hint="cs"/>
+        </w:rPr>
+        <w:t>يلي</w:t>
+      </w:r>
+      <w:r>
+        <w:t>:</w:t>
+      </w:r>
+    </w:p>
+    <w:p>
+      <w:r>
+        <w:t xml:space="preserve">{%p </w:t>
+      </w:r>
+      <w:proofErr w:type="spellStart"/>
+      <w:r>
+        <w:t>for</w:t>
+      </w:r>
+      <w:proofErr w:type="spellEnd"/>
+      <w:r>
+        <w:t xml:space="preserve"> a </w:t>
+      </w:r>
+      <w:proofErr w:type="spellStart"/>
+      <w:r>
+        <w:t>in</w:t>
+      </w:r>
+      <w:proofErr w:type="spellEnd"/>
+      <w:r>
+        <w:t xml:space="preserve"> </w:t>
+      </w:r>
+      <w:proofErr w:type="spellStart"/>
+      <w:r>
+        <w:t>articles</w:t>
+      </w:r>
+      <w:proofErr w:type="spellEnd"/>
+      <w:r>
+        <w:t xml:space="preserve"> %}</w:t>
       </w:r>
     </w:p>
     <w:p>
@@ -470,27 +1058,464 @@
         <w:jc w:val="both"/>
       </w:pPr>
       <w:r>
-        <w:t>ثانيا</w:t>
-      </w:r>
-      <w:r>
-        <w:t>:</w:t>
-      </w:r>
-      <w:r>
-        <w:t xml:space="preserve"> قررت الجمعية العامة غير العادية بموافقة الشركاء الحائزين على {{ approval_percentage }} من رأس مال الشركة ما </w:t>
-      </w:r>
-      <w:r>
-        <w:rPr>
-          <w:rFonts w:hint="cs"/>
-        </w:rPr>
-        <w:t>يلي</w:t>
-      </w:r>
-      <w:r>
-        <w:t>:</w:t>
-      </w:r>
+        <w:rPr>
+          <w:b/>
+          <w:bCs/>
+        </w:rPr>
+        <w:t xml:space="preserve">تعديل </w:t>
+      </w:r>
+      <w:proofErr w:type="gramStart"/>
+      <w:r>
+        <w:rPr>
+          <w:b/>
+          <w:bCs/>
+        </w:rPr>
+        <w:t xml:space="preserve">{{ </w:t>
+      </w:r>
+      <w:proofErr w:type="spellStart"/>
+      <w:r>
+        <w:rPr>
+          <w:b/>
+          <w:bCs/>
+        </w:rPr>
+        <w:t>a</w:t>
+      </w:r>
+      <w:proofErr w:type="gramEnd"/>
+      <w:r>
+        <w:rPr>
+          <w:b/>
+          <w:bCs/>
+        </w:rPr>
+        <w:t>.article_</w:t>
+      </w:r>
+      <w:proofErr w:type="gramStart"/>
+      <w:r>
+        <w:rPr>
+          <w:b/>
+          <w:bCs/>
+        </w:rPr>
+        <w:t>name</w:t>
+      </w:r>
+      <w:proofErr w:type="spellEnd"/>
+      <w:r>
+        <w:rPr>
+          <w:b/>
+          <w:bCs/>
+        </w:rPr>
+        <w:t xml:space="preserve"> }</w:t>
+      </w:r>
+      <w:proofErr w:type="gramEnd"/>
+      <w:r>
+        <w:rPr>
+          <w:b/>
+          <w:bCs/>
+        </w:rPr>
+        <w:t xml:space="preserve">} من عقد تأسيس الشركة ونظامها </w:t>
+      </w:r>
+      <w:proofErr w:type="spellStart"/>
+      <w:r>
+        <w:rPr>
+          <w:b/>
+          <w:bCs/>
+        </w:rPr>
+        <w:t>الأساسى</w:t>
+      </w:r>
+      <w:proofErr w:type="spellEnd"/>
     </w:p>
     <w:p>
-      <w:r>
-        <w:t>{%p for a in articles %}</w:t>
+      <w:pPr>
+        <w:bidi/>
+        <w:spacing w:after="200" w:line="265" w:lineRule="auto"/>
+        <w:jc w:val="both"/>
+      </w:pPr>
+      <w:proofErr w:type="gramStart"/>
+      <w:r>
+        <w:rPr>
+          <w:b/>
+          <w:bCs/>
+          <w:sz w:val="20"/>
+          <w:szCs w:val="20"/>
+        </w:rPr>
+        <w:t xml:space="preserve">{{ </w:t>
+      </w:r>
+      <w:proofErr w:type="spellStart"/>
+      <w:r>
+        <w:rPr>
+          <w:b/>
+          <w:bCs/>
+          <w:sz w:val="20"/>
+          <w:szCs w:val="20"/>
+        </w:rPr>
+        <w:t>a</w:t>
+      </w:r>
+      <w:proofErr w:type="gramEnd"/>
+      <w:r>
+        <w:rPr>
+          <w:b/>
+          <w:bCs/>
+          <w:sz w:val="20"/>
+          <w:szCs w:val="20"/>
+        </w:rPr>
+        <w:t>.article_</w:t>
+      </w:r>
+      <w:proofErr w:type="gramStart"/>
+      <w:r>
+        <w:rPr>
+          <w:b/>
+          <w:bCs/>
+          <w:sz w:val="20"/>
+          <w:szCs w:val="20"/>
+        </w:rPr>
+        <w:t>name</w:t>
+      </w:r>
+      <w:proofErr w:type="spellEnd"/>
+      <w:r>
+        <w:rPr>
+          <w:b/>
+          <w:bCs/>
+          <w:sz w:val="20"/>
+          <w:szCs w:val="20"/>
+        </w:rPr>
+        <w:t xml:space="preserve"> }</w:t>
+      </w:r>
+      <w:proofErr w:type="gramEnd"/>
+      <w:r>
+        <w:rPr>
+          <w:b/>
+          <w:bCs/>
+          <w:sz w:val="20"/>
+          <w:szCs w:val="20"/>
+        </w:rPr>
+        <w:t>} قبل التعديل</w:t>
+      </w:r>
+      <w:r>
+        <w:rPr>
+          <w:b/>
+          <w:bCs/>
+          <w:sz w:val="20"/>
+          <w:szCs w:val="20"/>
+        </w:rPr>
+        <w:t>:</w:t>
+      </w:r>
+    </w:p>
+    <w:p>
+      <w:pPr>
+        <w:bidi/>
+        <w:spacing w:after="300" w:line="265" w:lineRule="auto"/>
+        <w:jc w:val="both"/>
+      </w:pPr>
+      <w:proofErr w:type="gramStart"/>
+      <w:r>
+        <w:rPr>
+          <w:sz w:val="20"/>
+          <w:szCs w:val="20"/>
+        </w:rPr>
+        <w:t xml:space="preserve">{{ </w:t>
+      </w:r>
+      <w:proofErr w:type="spellStart"/>
+      <w:r>
+        <w:rPr>
+          <w:sz w:val="20"/>
+          <w:szCs w:val="20"/>
+        </w:rPr>
+        <w:t>a</w:t>
+      </w:r>
+      <w:proofErr w:type="gramEnd"/>
+      <w:r>
+        <w:rPr>
+          <w:sz w:val="20"/>
+          <w:szCs w:val="20"/>
+        </w:rPr>
+        <w:t>.article_original_</w:t>
+      </w:r>
+      <w:proofErr w:type="gramStart"/>
+      <w:r>
+        <w:rPr>
+          <w:sz w:val="20"/>
+          <w:szCs w:val="20"/>
+        </w:rPr>
+        <w:t>content</w:t>
+      </w:r>
+      <w:proofErr w:type="spellEnd"/>
+      <w:r>
+        <w:rPr>
+          <w:sz w:val="20"/>
+          <w:szCs w:val="20"/>
+        </w:rPr>
+        <w:t xml:space="preserve"> }</w:t>
+      </w:r>
+      <w:proofErr w:type="gramEnd"/>
+      <w:r>
+        <w:rPr>
+          <w:sz w:val="20"/>
+          <w:szCs w:val="20"/>
+        </w:rPr>
+        <w:t>}</w:t>
+      </w:r>
+    </w:p>
+    <w:p>
+      <w:pPr>
+        <w:bidi/>
+        <w:spacing w:after="200" w:line="265" w:lineRule="auto"/>
+        <w:jc w:val="both"/>
+      </w:pPr>
+      <w:proofErr w:type="gramStart"/>
+      <w:r>
+        <w:rPr>
+          <w:b/>
+          <w:bCs/>
+          <w:sz w:val="20"/>
+          <w:szCs w:val="20"/>
+        </w:rPr>
+        <w:t xml:space="preserve">{{ </w:t>
+      </w:r>
+      <w:proofErr w:type="spellStart"/>
+      <w:r>
+        <w:rPr>
+          <w:b/>
+          <w:bCs/>
+          <w:sz w:val="20"/>
+          <w:szCs w:val="20"/>
+        </w:rPr>
+        <w:t>a</w:t>
+      </w:r>
+      <w:proofErr w:type="gramEnd"/>
+      <w:r>
+        <w:rPr>
+          <w:b/>
+          <w:bCs/>
+          <w:sz w:val="20"/>
+          <w:szCs w:val="20"/>
+        </w:rPr>
+        <w:t>.article_</w:t>
+      </w:r>
+      <w:proofErr w:type="gramStart"/>
+      <w:r>
+        <w:rPr>
+          <w:b/>
+          <w:bCs/>
+          <w:sz w:val="20"/>
+          <w:szCs w:val="20"/>
+        </w:rPr>
+        <w:t>name</w:t>
+      </w:r>
+      <w:proofErr w:type="spellEnd"/>
+      <w:r>
+        <w:rPr>
+          <w:b/>
+          <w:bCs/>
+          <w:sz w:val="20"/>
+          <w:szCs w:val="20"/>
+        </w:rPr>
+        <w:t xml:space="preserve"> }</w:t>
+      </w:r>
+      <w:proofErr w:type="gramEnd"/>
+      <w:r>
+        <w:rPr>
+          <w:b/>
+          <w:bCs/>
+          <w:sz w:val="20"/>
+          <w:szCs w:val="20"/>
+        </w:rPr>
+        <w:t>} بعد التعديل</w:t>
+      </w:r>
+      <w:r>
+        <w:rPr>
+          <w:b/>
+          <w:bCs/>
+          <w:sz w:val="20"/>
+          <w:szCs w:val="20"/>
+        </w:rPr>
+        <w:t>:</w:t>
+      </w:r>
+    </w:p>
+    <w:p>
+      <w:pPr>
+        <w:bidi/>
+        <w:spacing w:after="300" w:line="265" w:lineRule="auto"/>
+        <w:jc w:val="both"/>
+      </w:pPr>
+      <w:proofErr w:type="gramStart"/>
+      <w:r>
+        <w:rPr>
+          <w:sz w:val="20"/>
+          <w:szCs w:val="20"/>
+        </w:rPr>
+        <w:t xml:space="preserve">{{ </w:t>
+      </w:r>
+      <w:proofErr w:type="spellStart"/>
+      <w:r>
+        <w:rPr>
+          <w:sz w:val="20"/>
+          <w:szCs w:val="20"/>
+        </w:rPr>
+        <w:t>a</w:t>
+      </w:r>
+      <w:proofErr w:type="gramEnd"/>
+      <w:r>
+        <w:rPr>
+          <w:sz w:val="20"/>
+          <w:szCs w:val="20"/>
+        </w:rPr>
+        <w:t>.article_new_</w:t>
+      </w:r>
+      <w:proofErr w:type="gramStart"/>
+      <w:r>
+        <w:rPr>
+          <w:sz w:val="20"/>
+          <w:szCs w:val="20"/>
+        </w:rPr>
+        <w:t>content</w:t>
+      </w:r>
+      <w:proofErr w:type="spellEnd"/>
+      <w:r>
+        <w:rPr>
+          <w:sz w:val="20"/>
+          <w:szCs w:val="20"/>
+        </w:rPr>
+        <w:t xml:space="preserve"> }</w:t>
+      </w:r>
+      <w:proofErr w:type="gramEnd"/>
+      <w:r>
+        <w:rPr>
+          <w:sz w:val="20"/>
+          <w:szCs w:val="20"/>
+        </w:rPr>
+        <w:t>}</w:t>
+      </w:r>
+    </w:p>
+    <w:p>
+      <w:pPr>
+        <w:bidi/>
+        <w:spacing w:after="300" w:line="265" w:lineRule="auto"/>
+        <w:jc w:val="both"/>
+      </w:pPr>
+      <w:r>
+        <w:t xml:space="preserve">{%p </w:t>
+      </w:r>
+      <w:proofErr w:type="spellStart"/>
+      <w:r>
+        <w:t>endfor</w:t>
+      </w:r>
+      <w:proofErr w:type="spellEnd"/>
+      <w:r>
+        <w:t xml:space="preserve"> %}</w:t>
+      </w:r>
+    </w:p>
+    <w:p>
+      <w:pPr>
+        <w:bidi/>
+        <w:spacing w:after="300" w:line="265" w:lineRule="auto"/>
+        <w:jc w:val="both"/>
+      </w:pPr>
+      <w:r>
+        <w:t>ثالثا</w:t>
+      </w:r>
+      <w:r>
+        <w:t>:</w:t>
+      </w:r>
+      <w:r>
+        <w:t xml:space="preserve"> يعمل بهذا القرار فور اتمام الاجراءات القانونية المنصوص عليها بالقانون رقم </w:t>
+      </w:r>
+      <w:proofErr w:type="gramStart"/>
+      <w:r>
+        <w:t xml:space="preserve">{{ </w:t>
+      </w:r>
+      <w:proofErr w:type="spellStart"/>
+      <w:r>
+        <w:t>law</w:t>
+      </w:r>
+      <w:proofErr w:type="gramEnd"/>
+      <w:r>
+        <w:t>_</w:t>
+      </w:r>
+      <w:proofErr w:type="gramStart"/>
+      <w:r>
+        <w:t>number</w:t>
+      </w:r>
+      <w:proofErr w:type="spellEnd"/>
+      <w:r>
+        <w:t xml:space="preserve"> }</w:t>
+      </w:r>
+      <w:proofErr w:type="gramEnd"/>
+      <w:r>
+        <w:t xml:space="preserve">} لسنة </w:t>
+      </w:r>
+      <w:proofErr w:type="gramStart"/>
+      <w:r>
+        <w:t xml:space="preserve">{{ </w:t>
+      </w:r>
+      <w:proofErr w:type="spellStart"/>
+      <w:r>
+        <w:t>law</w:t>
+      </w:r>
+      <w:proofErr w:type="gramEnd"/>
+      <w:r>
+        <w:t>_</w:t>
+      </w:r>
+      <w:proofErr w:type="gramStart"/>
+      <w:r>
+        <w:t>year</w:t>
+      </w:r>
+      <w:proofErr w:type="spellEnd"/>
+      <w:r>
+        <w:t xml:space="preserve"> }</w:t>
+      </w:r>
+      <w:proofErr w:type="gramEnd"/>
+      <w:r>
+        <w:t>} ولائحته التنفيذية وتعديلاتها بالهيئة العامة للاستثمار والمناطق الحرة.</w:t>
+      </w:r>
+    </w:p>
+    <w:p>
+      <w:pPr>
+        <w:bidi/>
+        <w:spacing w:after="300" w:line="265" w:lineRule="auto"/>
+        <w:jc w:val="both"/>
+      </w:pPr>
+      <w:r>
+        <w:t>رابعا</w:t>
+      </w:r>
+      <w:r>
+        <w:t>:</w:t>
+      </w:r>
+      <w:r>
+        <w:t xml:space="preserve"> تفويض كلا من الساد</w:t>
+      </w:r>
+      <w:r>
+        <w:rPr>
+          <w:rFonts w:hint="cs"/>
+        </w:rPr>
+        <w:t>ة</w:t>
+      </w:r>
+      <w:r>
+        <w:t xml:space="preserve">/ </w:t>
+      </w:r>
+      <w:proofErr w:type="gramStart"/>
+      <w:r>
+        <w:t xml:space="preserve">{{ </w:t>
+      </w:r>
+      <w:proofErr w:type="spellStart"/>
+      <w:r>
+        <w:t>names</w:t>
+      </w:r>
+      <w:proofErr w:type="gramEnd"/>
+      <w:r>
+        <w:t>_of_</w:t>
+      </w:r>
+      <w:proofErr w:type="gramStart"/>
+      <w:r>
+        <w:t>commissioners</w:t>
+      </w:r>
+      <w:proofErr w:type="spellEnd"/>
+      <w:r>
+        <w:t xml:space="preserve"> }</w:t>
+      </w:r>
+      <w:proofErr w:type="gramEnd"/>
+      <w:r>
+        <w:t>} (منفردين او مجتمعين) وذلك في اعتماد وتوثيق عقد وقرار التعديل في هيئة الاستثمار والتوقيع والتصديق في مكتب الشهر العقاري والتعامل مع السجل التجاري والتوقيع على العقد امام الشهر العقاري والغرفة التجارية ومصلحة الضرائب المصرية العامة وجميع الجهات الحكومية وغير الحكومية ولهم حق تفويض وتوكيل الأخرين في كل او بعض ما ذكر</w:t>
+      </w:r>
+      <w:r>
+        <w:t>.</w:t>
       </w:r>
     </w:p>
     <w:p>
@@ -504,153 +1529,87 @@
           <w:b/>
           <w:bCs/>
         </w:rPr>
-        <w:t>تعديل {{ a.article_name }} من عقد تأسيس الشركة ونظامها الأساسى</w:t>
-      </w:r>
-    </w:p>
-    <w:p>
-      <w:pPr>
-        <w:bidi/>
-        <w:spacing w:after="200" w:line="265" w:lineRule="auto"/>
-        <w:jc w:val="both"/>
-      </w:pPr>
-      <w:r>
-        <w:rPr>
-          <w:b/>
-          <w:bCs/>
-          <w:sz w:val="20"/>
-          <w:szCs w:val="20"/>
-        </w:rPr>
-        <w:t>{{ a.article_name }} قبل التعديل</w:t>
-      </w:r>
-      <w:r>
-        <w:rPr>
-          <w:b/>
-          <w:bCs/>
-          <w:sz w:val="20"/>
-          <w:szCs w:val="20"/>
-        </w:rPr>
-        <w:t>:</w:t>
-      </w:r>
-    </w:p>
-    <w:p>
-      <w:pPr>
-        <w:bidi/>
-        <w:spacing w:after="300" w:line="265" w:lineRule="auto"/>
-        <w:jc w:val="both"/>
-      </w:pPr>
-      <w:r>
-        <w:rPr>
-          <w:sz w:val="20"/>
-          <w:szCs w:val="20"/>
-        </w:rPr>
-        <w:t>{{ a.article_original_content }}</w:t>
-      </w:r>
-    </w:p>
-    <w:p>
-      <w:pPr>
-        <w:bidi/>
-        <w:spacing w:after="200" w:line="265" w:lineRule="auto"/>
-        <w:jc w:val="both"/>
-      </w:pPr>
-      <w:r>
-        <w:rPr>
-          <w:b/>
-          <w:bCs/>
-          <w:sz w:val="20"/>
-          <w:szCs w:val="20"/>
-        </w:rPr>
-        <w:t>{{ a.article_name }} بعد التعديل</w:t>
-      </w:r>
-      <w:r>
-        <w:rPr>
-          <w:b/>
-          <w:bCs/>
-          <w:sz w:val="20"/>
-          <w:szCs w:val="20"/>
-        </w:rPr>
-        <w:t>:</w:t>
-      </w:r>
-    </w:p>
-    <w:p>
-      <w:pPr>
-        <w:bidi/>
-        <w:spacing w:after="300" w:line="265" w:lineRule="auto"/>
-        <w:jc w:val="both"/>
-      </w:pPr>
-      <w:r>
-        <w:rPr>
-          <w:sz w:val="20"/>
-          <w:szCs w:val="20"/>
-        </w:rPr>
-        <w:t>{{ a.article_new_content }}</w:t>
-      </w:r>
-    </w:p>
-    <w:p>
-      <w:pPr>
-        <w:bidi/>
-        <w:spacing w:after="300" w:line="265" w:lineRule="auto"/>
-        <w:jc w:val="both"/>
-      </w:pPr>
-      <w:r>
-        <w:t>{%p endfor %}</w:t>
-      </w:r>
-    </w:p>
-    <w:p>
-      <w:pPr>
-        <w:bidi/>
-        <w:spacing w:after="300" w:line="265" w:lineRule="auto"/>
-        <w:jc w:val="both"/>
-      </w:pPr>
-      <w:r>
-        <w:t>ثالثا</w:t>
-      </w:r>
-      <w:r>
-        <w:t>:</w:t>
-      </w:r>
-      <w:r>
-        <w:t xml:space="preserve"> يعمل بهذا القرار فور اتمام الاجراءات القانونية المنصوص عليها بالقانون رقم {{ law_number }} لسنة {{ law_year }} ولائحته التنفيذية وتعديلاتها بالهيئة العامة للاستثمار والمناطق الحرة.</w:t>
-      </w:r>
-    </w:p>
-    <w:p>
-      <w:pPr>
-        <w:bidi/>
-        <w:spacing w:after="300" w:line="265" w:lineRule="auto"/>
-        <w:jc w:val="both"/>
-      </w:pPr>
-      <w:r>
-        <w:t>رابعا</w:t>
-      </w:r>
-      <w:r>
-        <w:t>:</w:t>
-      </w:r>
-      <w:r>
-        <w:t xml:space="preserve"> تفويض كلا من الساد</w:t>
-      </w:r>
-      <w:r>
-        <w:rPr>
-          <w:rFonts w:hint="cs"/>
-        </w:rPr>
-        <w:t>ة</w:t>
-      </w:r>
-      <w:r>
-        <w:t>/ {{ names_of_commissioners }} (منفردين او مجتمعين) وذلك في اعتماد وتوثيق عقد وقرار التعديل في هيئة الاستثمار والتوقيع والتصديق في مكتب الشهر العقاري والتعامل مع السجل التجاري والتوقيع على العقد امام الشهر العقاري والغرفة التجارية ومصلحة الضرائب المصرية العامة وجميع الجهات الحكومية وغير الحكومية ولهم حق تفويض وتوكيل الأخرين في كل او بعض ما ذكر</w:t>
-      </w:r>
-      <w:r>
-        <w:t>.</w:t>
-      </w:r>
-    </w:p>
-    <w:p>
-      <w:pPr>
-        <w:bidi/>
-        <w:spacing w:after="240" w:line="265" w:lineRule="auto"/>
-        <w:jc w:val="both"/>
-      </w:pPr>
-      <w:r>
-        <w:rPr>
-          <w:b/>
-          <w:bCs/>
-        </w:rPr>
-        <w:t>نقر نحن الموقعين أدناه بصفتنا شركاء بشركة {{ company_name }} بصحة ما ورد بهذا المحضر من بيانات ووقائع وذلك فى مواجهة الهيئة العامة للاستثمار والمناطق الحرة وفى مواجهة الغير، ونقر بالاحتفاظ بجميع المستندات المؤيدة لما ورد به فى مقر الشركة واتفاقها مع احكام القانون وعقد الشركة وتعديلاته والالتزام بتقديمها عند طلبها</w:t>
+        <w:t xml:space="preserve">نقر نحن الموقعين أدناه بصفتنا شركاء بشركة </w:t>
+      </w:r>
+      <w:proofErr w:type="gramStart"/>
+      <w:r>
+        <w:rPr>
+          <w:b/>
+          <w:bCs/>
+        </w:rPr>
+        <w:t xml:space="preserve">{{ </w:t>
+      </w:r>
+      <w:proofErr w:type="spellStart"/>
+      <w:r>
+        <w:rPr>
+          <w:b/>
+          <w:bCs/>
+        </w:rPr>
+        <w:t>company</w:t>
+      </w:r>
+      <w:proofErr w:type="gramEnd"/>
+      <w:r>
+        <w:rPr>
+          <w:b/>
+          <w:bCs/>
+        </w:rPr>
+        <w:t>_</w:t>
+      </w:r>
+      <w:proofErr w:type="gramStart"/>
+      <w:r>
+        <w:rPr>
+          <w:b/>
+          <w:bCs/>
+        </w:rPr>
+        <w:t>name</w:t>
+      </w:r>
+      <w:proofErr w:type="spellEnd"/>
+      <w:r>
+        <w:rPr>
+          <w:b/>
+          <w:bCs/>
+        </w:rPr>
+        <w:t xml:space="preserve"> }</w:t>
+      </w:r>
+      <w:proofErr w:type="gramEnd"/>
+      <w:r>
+        <w:rPr>
+          <w:b/>
+          <w:bCs/>
+        </w:rPr>
+        <w:t xml:space="preserve">} بصحة ما ورد بهذا المحضر من بيانات ووقائع وذلك </w:t>
+      </w:r>
+      <w:proofErr w:type="spellStart"/>
+      <w:r>
+        <w:rPr>
+          <w:b/>
+          <w:bCs/>
+        </w:rPr>
+        <w:t>فى</w:t>
+      </w:r>
+      <w:proofErr w:type="spellEnd"/>
+      <w:r>
+        <w:rPr>
+          <w:b/>
+          <w:bCs/>
+        </w:rPr>
+        <w:t xml:space="preserve"> مواجهة الهيئة العامة للاستثمار والمناطق الحرة وفى مواجهة الغير، ونقر بالاحتفاظ بجميع المستندات المؤيدة لما ورد به </w:t>
+      </w:r>
+      <w:proofErr w:type="spellStart"/>
+      <w:r>
+        <w:rPr>
+          <w:b/>
+          <w:bCs/>
+        </w:rPr>
+        <w:t>فى</w:t>
+      </w:r>
+      <w:proofErr w:type="spellEnd"/>
+      <w:r>
+        <w:rPr>
+          <w:b/>
+          <w:bCs/>
+        </w:rPr>
+        <w:t xml:space="preserve"> مقر الشركة واتفاقها مع احكام القانون وعقد الشركة وتعديلاته والالتزام بتقديمها عند طلبها</w:t>
       </w:r>
       <w:r>
         <w:rPr>
@@ -667,7 +1626,40 @@
         <w:jc w:val="both"/>
       </w:pPr>
       <w:r>
-        <w:t>وقد اختتم الاجتماع فى تمام الساعة {{ meeting_end_time }} من نفس اليوم.</w:t>
+        <w:lastRenderedPageBreak/>
+        <w:t xml:space="preserve">وقد اختتم الاجتماع </w:t>
+      </w:r>
+      <w:proofErr w:type="spellStart"/>
+      <w:r>
+        <w:t>فى</w:t>
+      </w:r>
+      <w:proofErr w:type="spellEnd"/>
+      <w:r>
+        <w:t xml:space="preserve"> تمام الساعة </w:t>
+      </w:r>
+      <w:proofErr w:type="gramStart"/>
+      <w:r>
+        <w:t xml:space="preserve">{{ </w:t>
+      </w:r>
+      <w:proofErr w:type="spellStart"/>
+      <w:r>
+        <w:t>meeting</w:t>
+      </w:r>
+      <w:proofErr w:type="gramEnd"/>
+      <w:r>
+        <w:t>_end_</w:t>
+      </w:r>
+      <w:proofErr w:type="gramStart"/>
+      <w:r>
+        <w:t>time</w:t>
+      </w:r>
+      <w:proofErr w:type="spellEnd"/>
+      <w:r>
+        <w:t xml:space="preserve"> }</w:t>
+      </w:r>
+      <w:proofErr w:type="gramEnd"/>
+      <w:r>
+        <w:t>} من نفس اليوم.</w:t>
       </w:r>
     </w:p>
     <w:tbl>
@@ -685,12 +1677,6 @@
         <w:gridCol w:w="4657"/>
       </w:tblGrid>
       <w:tr>
-        <w:tblPrEx>
-          <w:tblCellMar>
-            <w:top w:w="0" w:type="dxa"/>
-            <w:bottom w:w="0" w:type="dxa"/>
-          </w:tblCellMar>
-        </w:tblPrEx>
         <w:trPr>
           <w:cantSplit/>
         </w:trPr>
@@ -720,12 +1706,37 @@
               <w:spacing w:line="260" w:lineRule="auto"/>
               <w:jc w:val="center"/>
             </w:pPr>
+            <w:proofErr w:type="gramStart"/>
             <w:r>
               <w:rPr>
                 <w:sz w:val="20"/>
                 <w:szCs w:val="20"/>
               </w:rPr>
-              <w:t>{{ chairman_name }}</w:t>
+              <w:t xml:space="preserve">{{ </w:t>
+            </w:r>
+            <w:proofErr w:type="spellStart"/>
+            <w:r>
+              <w:rPr>
+                <w:sz w:val="20"/>
+                <w:szCs w:val="20"/>
+              </w:rPr>
+              <w:t>chairman</w:t>
+            </w:r>
+            <w:proofErr w:type="gramEnd"/>
+            <w:r>
+              <w:rPr>
+                <w:sz w:val="20"/>
+                <w:szCs w:val="20"/>
+              </w:rPr>
+              <w:t>_name</w:t>
+            </w:r>
+            <w:proofErr w:type="spellEnd"/>
+            <w:r>
+              <w:rPr>
+                <w:sz w:val="20"/>
+                <w:szCs w:val="20"/>
+              </w:rPr>
+              <w:t xml:space="preserve"> }}</w:t>
             </w:r>
           </w:p>
         </w:tc>
@@ -751,7 +1762,31 @@
           </w:p>
           <w:p>
             <w:r>
-              <w:t>{%p for p in attendees %}</w:t>
+              <w:t xml:space="preserve">{%p </w:t>
+            </w:r>
+            <w:proofErr w:type="spellStart"/>
+            <w:r>
+              <w:t>for</w:t>
+            </w:r>
+            <w:proofErr w:type="spellEnd"/>
+            <w:r>
+              <w:t xml:space="preserve"> p </w:t>
+            </w:r>
+            <w:proofErr w:type="spellStart"/>
+            <w:r>
+              <w:t>in</w:t>
+            </w:r>
+            <w:proofErr w:type="spellEnd"/>
+            <w:r>
+              <w:t xml:space="preserve"> </w:t>
+            </w:r>
+            <w:proofErr w:type="spellStart"/>
+            <w:r>
+              <w:t>attendees</w:t>
+            </w:r>
+            <w:proofErr w:type="spellEnd"/>
+            <w:r>
+              <w:t xml:space="preserve"> %}</w:t>
             </w:r>
           </w:p>
           <w:p>
@@ -760,12 +1795,37 @@
               <w:spacing w:line="260" w:lineRule="auto"/>
               <w:jc w:val="center"/>
             </w:pPr>
+            <w:proofErr w:type="gramStart"/>
             <w:r>
               <w:rPr>
                 <w:sz w:val="20"/>
                 <w:szCs w:val="20"/>
               </w:rPr>
-              <w:t>{{ p.name }}</w:t>
+              <w:t>{{ p</w:t>
+            </w:r>
+            <w:proofErr w:type="gramEnd"/>
+            <w:r>
+              <w:rPr>
+                <w:sz w:val="20"/>
+                <w:szCs w:val="20"/>
+              </w:rPr>
+              <w:t>.</w:t>
+            </w:r>
+            <w:proofErr w:type="gramStart"/>
+            <w:r>
+              <w:rPr>
+                <w:sz w:val="20"/>
+                <w:szCs w:val="20"/>
+              </w:rPr>
+              <w:t>name }</w:t>
+            </w:r>
+            <w:proofErr w:type="gramEnd"/>
+            <w:r>
+              <w:rPr>
+                <w:sz w:val="20"/>
+                <w:szCs w:val="20"/>
+              </w:rPr>
+              <w:t>}</w:t>
             </w:r>
           </w:p>
           <w:p>
@@ -775,7 +1835,15 @@
               <w:jc w:val="center"/>
             </w:pPr>
             <w:r>
-              <w:t>{%p endfor %}</w:t>
+              <w:t xml:space="preserve">{%p </w:t>
+            </w:r>
+            <w:proofErr w:type="spellStart"/>
+            <w:r>
+              <w:t>endfor</w:t>
+            </w:r>
+            <w:proofErr w:type="spellEnd"/>
+            <w:r>
+              <w:t xml:space="preserve"> %}</w:t>
             </w:r>
           </w:p>
         </w:tc>
@@ -823,6 +1891,7 @@
       <w:bidi/>
       <w:jc w:val="center"/>
     </w:pPr>
+    <w:proofErr w:type="gramStart"/>
     <w:r>
       <w:rPr>
         <w:b/>
@@ -830,7 +1899,57 @@
         <w:sz w:val="24"/>
         <w:szCs w:val="24"/>
       </w:rPr>
-      <w:t>{{ company_address }}</w:t>
+      <w:t xml:space="preserve">{{ </w:t>
+    </w:r>
+    <w:proofErr w:type="spellStart"/>
+    <w:r>
+      <w:rPr>
+        <w:b/>
+        <w:bCs/>
+        <w:sz w:val="24"/>
+        <w:szCs w:val="24"/>
+      </w:rPr>
+      <w:t>company</w:t>
+    </w:r>
+    <w:proofErr w:type="gramEnd"/>
+    <w:r>
+      <w:rPr>
+        <w:b/>
+        <w:bCs/>
+        <w:sz w:val="24"/>
+        <w:szCs w:val="24"/>
+      </w:rPr>
+      <w:t>_</w:t>
+    </w:r>
+    <w:proofErr w:type="gramStart"/>
+    <w:r>
+      <w:rPr>
+        <w:b/>
+        <w:bCs/>
+        <w:sz w:val="24"/>
+        <w:szCs w:val="24"/>
+      </w:rPr>
+      <w:t>address</w:t>
+    </w:r>
+    <w:proofErr w:type="spellEnd"/>
+    <w:r>
+      <w:rPr>
+        <w:b/>
+        <w:bCs/>
+        <w:sz w:val="24"/>
+        <w:szCs w:val="24"/>
+      </w:rPr>
+      <w:t xml:space="preserve"> }</w:t>
+    </w:r>
+    <w:proofErr w:type="gramEnd"/>
+    <w:r>
+      <w:rPr>
+        <w:b/>
+        <w:bCs/>
+        <w:sz w:val="24"/>
+        <w:szCs w:val="24"/>
+      </w:rPr>
+      <w:t>}</w:t>
     </w:r>
   </w:p>
 </w:ftr>
@@ -1604,6 +2723,48 @@
       <w:szCs w:val="20"/>
     </w:rPr>
   </w:style>
+  <w:style w:type="paragraph" w:styleId="Header">
+    <w:name w:val="header"/>
+    <w:basedOn w:val="Normal"/>
+    <w:link w:val="HeaderChar"/>
+    <w:uiPriority w:val="99"/>
+    <w:unhideWhenUsed/>
+    <w:rsid w:val="002859FC"/>
+    <w:pPr>
+      <w:tabs>
+        <w:tab w:val="center" w:pos="4680"/>
+        <w:tab w:val="right" w:pos="9360"/>
+      </w:tabs>
+    </w:pPr>
+  </w:style>
+  <w:style w:type="character" w:customStyle="1" w:styleId="HeaderChar">
+    <w:name w:val="Header Char"/>
+    <w:basedOn w:val="DefaultParagraphFont"/>
+    <w:link w:val="Header"/>
+    <w:uiPriority w:val="99"/>
+    <w:rsid w:val="002859FC"/>
+  </w:style>
+  <w:style w:type="paragraph" w:styleId="Footer">
+    <w:name w:val="footer"/>
+    <w:basedOn w:val="Normal"/>
+    <w:link w:val="FooterChar"/>
+    <w:uiPriority w:val="99"/>
+    <w:unhideWhenUsed/>
+    <w:rsid w:val="002859FC"/>
+    <w:pPr>
+      <w:tabs>
+        <w:tab w:val="center" w:pos="4680"/>
+        <w:tab w:val="right" w:pos="9360"/>
+      </w:tabs>
+    </w:pPr>
+  </w:style>
+  <w:style w:type="character" w:customStyle="1" w:styleId="FooterChar">
+    <w:name w:val="Footer Char"/>
+    <w:basedOn w:val="DefaultParagraphFont"/>
+    <w:link w:val="Footer"/>
+    <w:uiPriority w:val="99"/>
+    <w:rsid w:val="002859FC"/>
+  </w:style>
 </w:styles>
 </file>
 

</xml_diff>